<commit_message>
Fix forest plots: summary diamonds, page-fit figures, restored major inaccuracy plot
forest_plots_v2.py draws the pooled proportion as a diamond with the prediction interval; build_docx.py scales figures to fit the page and appends all three by-study plots plus arm panels. Manuscript text and log updated with the correction note. No pooled number changed.

Signed-off-by: Raphael Malikian <rtmalikian@gmail.com>
</commit_message>
<xml_diff>
--- a/manuscript.docx
+++ b/manuscript.docx
@@ -1164,7 +1164,7 @@
         <w:rPr>
           <w:sz w:val="22"/>
         </w:rPr>
-        <w:t>Forest plots for the three outcomes sit in forest-fabricated.png, forest-major_inaccuracy.png and forest-fully_accurate.png.</w:t>
+        <w:t>Forest plots are printed after the references in this manuscript: one by-study plot per outcome (Figures 1 to 3), with the random-effects pooled proportion drawn as a diamond and the prediction interval as a capped line under it, and arm-level panels in the appendix figures. The plot files are forest-fabricated-bystudy.png, forest-fully_accurate-bystudy.png and forest-major_inaccuracy-bystudy.png for the by-study plots, and forest-fabricated-arms-1 to 3.png, forest-fully_accurate-arms-1 to 2.png and forest-major_inaccuracy-arms-1.png for the arm panels, all produced by forest_plots_v2.py. An earlier plot build (forest_plots.py, files forest-fabricated.png, forest-major_inaccuracy.png and forest-fully_accurate.png) drew no summary diamond and its images overflowed the page in the first PDF, so the major inaccuracy plot was also left out of that PDF; the fault and the fix are logged in llm-team-log.md, and the first-build files are kept in the repository for the record.</w:t>
       </w:r>
     </w:p>
     <w:p>
@@ -1423,16 +1423,17 @@
     <w:p>
       <w:pPr>
         <w:pStyle w:val="Heading1"/>
+        <w:keepNext/>
       </w:pPr>
       <w:r>
-        <w:t>Forest plot: completely fabricated</w:t>
+        <w:t>Forest plot: completely fabricated, by study</w:t>
       </w:r>
     </w:p>
     <w:p>
       <w:r>
         <w:drawing>
           <wp:inline xmlns:a="http://schemas.openxmlformats.org/drawingml/2006/main" xmlns:pic="http://schemas.openxmlformats.org/drawingml/2006/picture">
-            <wp:extent cx="5943600" cy="9699955"/>
+            <wp:extent cx="6126480" cy="3675888"/>
             <wp:docPr id="1" name="Picture 1"/>
             <wp:cNvGraphicFramePr>
               <a:graphicFrameLocks noChangeAspect="1"/>
@@ -1441,7 +1442,7 @@
               <a:graphicData uri="http://schemas.openxmlformats.org/drawingml/2006/picture">
                 <pic:pic>
                   <pic:nvPicPr>
-                    <pic:cNvPr id="0" name="forest-fabricated.png"/>
+                    <pic:cNvPr id="0" name="forest-fabricated-bystudy.png"/>
                     <pic:cNvPicPr/>
                   </pic:nvPicPr>
                   <pic:blipFill>
@@ -1453,7 +1454,7 @@
                   <pic:spPr>
                     <a:xfrm>
                       <a:off x="0" y="0"/>
-                      <a:ext cx="5943600" cy="9699955"/>
+                      <a:ext cx="6126480" cy="3675888"/>
                     </a:xfrm>
                     <a:prstGeom prst="rect"/>
                   </pic:spPr>
@@ -1465,18 +1466,27 @@
       </w:r>
     </w:p>
     <w:p>
+      <w:r>
+        <w:rPr>
+          <w:sz w:val="18"/>
+        </w:rPr>
+        <w:t>Figure 1. One row per study (study totals across its model arms). The diamond is the arm-level random-effects pooled proportion, 18.6% (95% CI 12.8 to 26.3); the capped line under it is the 95% prediction interval, 0.9 to 84.7%. The per-study sensitivity pool was 23.0%.</w:t>
+      </w:r>
+    </w:p>
+    <w:p>
       <w:pPr>
         <w:pStyle w:val="Heading1"/>
+        <w:keepNext/>
       </w:pPr>
       <w:r>
-        <w:t>Forest plot: fully accurate</w:t>
+        <w:t>Forest plot: fully accurate, by study</w:t>
       </w:r>
     </w:p>
     <w:p>
       <w:r>
         <w:drawing>
           <wp:inline xmlns:a="http://schemas.openxmlformats.org/drawingml/2006/main" xmlns:pic="http://schemas.openxmlformats.org/drawingml/2006/picture">
-            <wp:extent cx="5943600" cy="7988198"/>
+            <wp:extent cx="6126480" cy="2800677"/>
             <wp:docPr id="2" name="Picture 2"/>
             <wp:cNvGraphicFramePr>
               <a:graphicFrameLocks noChangeAspect="1"/>
@@ -1485,7 +1495,7 @@
               <a:graphicData uri="http://schemas.openxmlformats.org/drawingml/2006/picture">
                 <pic:pic>
                   <pic:nvPicPr>
-                    <pic:cNvPr id="0" name="forest-fully_accurate.png"/>
+                    <pic:cNvPr id="0" name="forest-fully_accurate-bystudy.png"/>
                     <pic:cNvPicPr/>
                   </pic:nvPicPr>
                   <pic:blipFill>
@@ -1497,7 +1507,7 @@
                   <pic:spPr>
                     <a:xfrm>
                       <a:off x="0" y="0"/>
-                      <a:ext cx="5943600" cy="7988198"/>
+                      <a:ext cx="6126480" cy="2800677"/>
                     </a:xfrm>
                     <a:prstGeom prst="rect"/>
                   </pic:spPr>
@@ -1509,8 +1519,401 @@
       </w:r>
     </w:p>
     <w:p>
+      <w:r>
+        <w:rPr>
+          <w:sz w:val="18"/>
+        </w:rPr>
+        <w:t>Figure 2. One row per study. Diamond: arm-level pooled proportion fully accurate, 29.4% (95% CI 19.5 to 41.7); capped line: 95% prediction interval. Per-study sensitivity pool 41.2%.</w:t>
+      </w:r>
+    </w:p>
+    <w:p>
       <w:pPr>
         <w:pStyle w:val="Heading1"/>
+        <w:keepNext/>
+      </w:pPr>
+      <w:r>
+        <w:t>Forest plot: any major inaccuracy, by study</w:t>
+      </w:r>
+    </w:p>
+    <w:p>
+      <w:r>
+        <w:drawing>
+          <wp:inline xmlns:a="http://schemas.openxmlformats.org/drawingml/2006/main" xmlns:pic="http://schemas.openxmlformats.org/drawingml/2006/picture">
+            <wp:extent cx="6126480" cy="1867118"/>
+            <wp:docPr id="3" name="Picture 3"/>
+            <wp:cNvGraphicFramePr>
+              <a:graphicFrameLocks noChangeAspect="1"/>
+            </wp:cNvGraphicFramePr>
+            <a:graphic>
+              <a:graphicData uri="http://schemas.openxmlformats.org/drawingml/2006/picture">
+                <pic:pic>
+                  <pic:nvPicPr>
+                    <pic:cNvPr id="0" name="forest-major_inaccuracy-bystudy.png"/>
+                    <pic:cNvPicPr/>
+                  </pic:nvPicPr>
+                  <pic:blipFill>
+                    <a:blip r:embed="rId11"/>
+                    <a:stretch>
+                      <a:fillRect/>
+                    </a:stretch>
+                  </pic:blipFill>
+                  <pic:spPr>
+                    <a:xfrm>
+                      <a:off x="0" y="0"/>
+                      <a:ext cx="6126480" cy="1867118"/>
+                    </a:xfrm>
+                    <a:prstGeom prst="rect"/>
+                  </pic:spPr>
+                </pic:pic>
+              </a:graphicData>
+            </a:graphic>
+          </wp:inline>
+        </w:drawing>
+      </w:r>
+    </w:p>
+    <w:p>
+      <w:r>
+        <w:rPr>
+          <w:sz w:val="18"/>
+        </w:rPr>
+        <w:t>Figure 3. One row per study. Diamond: pooled proportion with any major inaccuracy including fabricated, 36.0% (95% CI 19.8 to 56.3), from 9 arms in 5 studies. This figure was missing from the first build and is restored here.</w:t>
+      </w:r>
+    </w:p>
+    <w:p>
+      <w:r>
+        <w:br w:type="page"/>
+      </w:r>
+    </w:p>
+    <w:p>
+      <w:pPr>
+        <w:pStyle w:val="Heading1"/>
+      </w:pPr>
+      <w:r>
+        <w:t>Appendix figures: forest plots by model arm</w:t>
+      </w:r>
+    </w:p>
+    <w:p>
+      <w:pPr>
+        <w:pStyle w:val="Heading1"/>
+        <w:keepNext/>
+      </w:pPr>
+      <w:r>
+        <w:t>Fabricated, arms 1 of 3</w:t>
+      </w:r>
+    </w:p>
+    <w:p>
+      <w:r>
+        <w:drawing>
+          <wp:inline xmlns:a="http://schemas.openxmlformats.org/drawingml/2006/main" xmlns:pic="http://schemas.openxmlformats.org/drawingml/2006/picture">
+            <wp:extent cx="6126480" cy="4376057"/>
+            <wp:docPr id="4" name="Picture 4"/>
+            <wp:cNvGraphicFramePr>
+              <a:graphicFrameLocks noChangeAspect="1"/>
+            </wp:cNvGraphicFramePr>
+            <a:graphic>
+              <a:graphicData uri="http://schemas.openxmlformats.org/drawingml/2006/picture">
+                <pic:pic>
+                  <pic:nvPicPr>
+                    <pic:cNvPr id="0" name="forest-fabricated-arms-1.png"/>
+                    <pic:cNvPicPr/>
+                  </pic:nvPicPr>
+                  <pic:blipFill>
+                    <a:blip r:embed="rId12"/>
+                    <a:stretch>
+                      <a:fillRect/>
+                    </a:stretch>
+                  </pic:blipFill>
+                  <pic:spPr>
+                    <a:xfrm>
+                      <a:off x="0" y="0"/>
+                      <a:ext cx="6126480" cy="4376057"/>
+                    </a:xfrm>
+                    <a:prstGeom prst="rect"/>
+                  </pic:spPr>
+                </pic:pic>
+              </a:graphicData>
+            </a:graphic>
+          </wp:inline>
+        </w:drawing>
+      </w:r>
+    </w:p>
+    <w:p>
+      <w:r>
+        <w:rPr>
+          <w:sz w:val="18"/>
+        </w:rPr>
+        <w:t>Fabricated, arms 1 of 3. The diamond on each panel is the overall arm-level pool.</w:t>
+      </w:r>
+    </w:p>
+    <w:p>
+      <w:pPr>
+        <w:pStyle w:val="Heading1"/>
+        <w:keepNext/>
+      </w:pPr>
+      <w:r>
+        <w:t>Fabricated, arms 2 of 3</w:t>
+      </w:r>
+    </w:p>
+    <w:p>
+      <w:r>
+        <w:drawing>
+          <wp:inline xmlns:a="http://schemas.openxmlformats.org/drawingml/2006/main" xmlns:pic="http://schemas.openxmlformats.org/drawingml/2006/picture">
+            <wp:extent cx="6126480" cy="4376057"/>
+            <wp:docPr id="5" name="Picture 5"/>
+            <wp:cNvGraphicFramePr>
+              <a:graphicFrameLocks noChangeAspect="1"/>
+            </wp:cNvGraphicFramePr>
+            <a:graphic>
+              <a:graphicData uri="http://schemas.openxmlformats.org/drawingml/2006/picture">
+                <pic:pic>
+                  <pic:nvPicPr>
+                    <pic:cNvPr id="0" name="forest-fabricated-arms-2.png"/>
+                    <pic:cNvPicPr/>
+                  </pic:nvPicPr>
+                  <pic:blipFill>
+                    <a:blip r:embed="rId13"/>
+                    <a:stretch>
+                      <a:fillRect/>
+                    </a:stretch>
+                  </pic:blipFill>
+                  <pic:spPr>
+                    <a:xfrm>
+                      <a:off x="0" y="0"/>
+                      <a:ext cx="6126480" cy="4376057"/>
+                    </a:xfrm>
+                    <a:prstGeom prst="rect"/>
+                  </pic:spPr>
+                </pic:pic>
+              </a:graphicData>
+            </a:graphic>
+          </wp:inline>
+        </w:drawing>
+      </w:r>
+    </w:p>
+    <w:p>
+      <w:r>
+        <w:rPr>
+          <w:sz w:val="18"/>
+        </w:rPr>
+        <w:t>Fabricated, arms 2 of 3.</w:t>
+      </w:r>
+    </w:p>
+    <w:p>
+      <w:pPr>
+        <w:pStyle w:val="Heading1"/>
+        <w:keepNext/>
+      </w:pPr>
+      <w:r>
+        <w:t>Fabricated, arms 3 of 3, with the prediction interval</w:t>
+      </w:r>
+    </w:p>
+    <w:p>
+      <w:r>
+        <w:drawing>
+          <wp:inline xmlns:a="http://schemas.openxmlformats.org/drawingml/2006/main" xmlns:pic="http://schemas.openxmlformats.org/drawingml/2006/picture">
+            <wp:extent cx="6126480" cy="1867118"/>
+            <wp:docPr id="6" name="Picture 6"/>
+            <wp:cNvGraphicFramePr>
+              <a:graphicFrameLocks noChangeAspect="1"/>
+            </wp:cNvGraphicFramePr>
+            <a:graphic>
+              <a:graphicData uri="http://schemas.openxmlformats.org/drawingml/2006/picture">
+                <pic:pic>
+                  <pic:nvPicPr>
+                    <pic:cNvPr id="0" name="forest-fabricated-arms-3.png"/>
+                    <pic:cNvPicPr/>
+                  </pic:nvPicPr>
+                  <pic:blipFill>
+                    <a:blip r:embed="rId14"/>
+                    <a:stretch>
+                      <a:fillRect/>
+                    </a:stretch>
+                  </pic:blipFill>
+                  <pic:spPr>
+                    <a:xfrm>
+                      <a:off x="0" y="0"/>
+                      <a:ext cx="6126480" cy="1867118"/>
+                    </a:xfrm>
+                    <a:prstGeom prst="rect"/>
+                  </pic:spPr>
+                </pic:pic>
+              </a:graphicData>
+            </a:graphic>
+          </wp:inline>
+        </w:drawing>
+      </w:r>
+    </w:p>
+    <w:p>
+      <w:r>
+        <w:rPr>
+          <w:sz w:val="18"/>
+        </w:rPr>
+        <w:t>Fabricated, arms 3 of 3, with the prediction interval.</w:t>
+      </w:r>
+    </w:p>
+    <w:p>
+      <w:pPr>
+        <w:pStyle w:val="Heading1"/>
+        <w:keepNext/>
+      </w:pPr>
+      <w:r>
+        <w:t>Fully accurate, arms 1 of 2</w:t>
+      </w:r>
+    </w:p>
+    <w:p>
+      <w:r>
+        <w:drawing>
+          <wp:inline xmlns:a="http://schemas.openxmlformats.org/drawingml/2006/main" xmlns:pic="http://schemas.openxmlformats.org/drawingml/2006/picture">
+            <wp:extent cx="6126480" cy="4376057"/>
+            <wp:docPr id="7" name="Picture 7"/>
+            <wp:cNvGraphicFramePr>
+              <a:graphicFrameLocks noChangeAspect="1"/>
+            </wp:cNvGraphicFramePr>
+            <a:graphic>
+              <a:graphicData uri="http://schemas.openxmlformats.org/drawingml/2006/picture">
+                <pic:pic>
+                  <pic:nvPicPr>
+                    <pic:cNvPr id="0" name="forest-fully_accurate-arms-1.png"/>
+                    <pic:cNvPicPr/>
+                  </pic:nvPicPr>
+                  <pic:blipFill>
+                    <a:blip r:embed="rId15"/>
+                    <a:stretch>
+                      <a:fillRect/>
+                    </a:stretch>
+                  </pic:blipFill>
+                  <pic:spPr>
+                    <a:xfrm>
+                      <a:off x="0" y="0"/>
+                      <a:ext cx="6126480" cy="4376057"/>
+                    </a:xfrm>
+                    <a:prstGeom prst="rect"/>
+                  </pic:spPr>
+                </pic:pic>
+              </a:graphicData>
+            </a:graphic>
+          </wp:inline>
+        </w:drawing>
+      </w:r>
+    </w:p>
+    <w:p>
+      <w:r>
+        <w:rPr>
+          <w:sz w:val="18"/>
+        </w:rPr>
+        <w:t>Fully accurate, arms 1 of 2.</w:t>
+      </w:r>
+    </w:p>
+    <w:p>
+      <w:pPr>
+        <w:pStyle w:val="Heading1"/>
+        <w:keepNext/>
+      </w:pPr>
+      <w:r>
+        <w:t>Fully accurate, arms 2 of 2, with the prediction interval</w:t>
+      </w:r>
+    </w:p>
+    <w:p>
+      <w:r>
+        <w:drawing>
+          <wp:inline xmlns:a="http://schemas.openxmlformats.org/drawingml/2006/main" xmlns:pic="http://schemas.openxmlformats.org/drawingml/2006/picture">
+            <wp:extent cx="6126480" cy="4025973"/>
+            <wp:docPr id="8" name="Picture 8"/>
+            <wp:cNvGraphicFramePr>
+              <a:graphicFrameLocks noChangeAspect="1"/>
+            </wp:cNvGraphicFramePr>
+            <a:graphic>
+              <a:graphicData uri="http://schemas.openxmlformats.org/drawingml/2006/picture">
+                <pic:pic>
+                  <pic:nvPicPr>
+                    <pic:cNvPr id="0" name="forest-fully_accurate-arms-2.png"/>
+                    <pic:cNvPicPr/>
+                  </pic:nvPicPr>
+                  <pic:blipFill>
+                    <a:blip r:embed="rId16"/>
+                    <a:stretch>
+                      <a:fillRect/>
+                    </a:stretch>
+                  </pic:blipFill>
+                  <pic:spPr>
+                    <a:xfrm>
+                      <a:off x="0" y="0"/>
+                      <a:ext cx="6126480" cy="4025973"/>
+                    </a:xfrm>
+                    <a:prstGeom prst="rect"/>
+                  </pic:spPr>
+                </pic:pic>
+              </a:graphicData>
+            </a:graphic>
+          </wp:inline>
+        </w:drawing>
+      </w:r>
+    </w:p>
+    <w:p>
+      <w:r>
+        <w:rPr>
+          <w:sz w:val="18"/>
+        </w:rPr>
+        <w:t>Fully accurate, arms 2 of 2, with the prediction interval.</w:t>
+      </w:r>
+    </w:p>
+    <w:p>
+      <w:pPr>
+        <w:pStyle w:val="Heading1"/>
+        <w:keepNext/>
+      </w:pPr>
+      <w:r>
+        <w:t>Any major inaccuracy, all 9 arms</w:t>
+      </w:r>
+    </w:p>
+    <w:p>
+      <w:r>
+        <w:drawing>
+          <wp:inline xmlns:a="http://schemas.openxmlformats.org/drawingml/2006/main" xmlns:pic="http://schemas.openxmlformats.org/drawingml/2006/picture">
+            <wp:extent cx="6126480" cy="2097590"/>
+            <wp:docPr id="9" name="Picture 9"/>
+            <wp:cNvGraphicFramePr>
+              <a:graphicFrameLocks noChangeAspect="1"/>
+            </wp:cNvGraphicFramePr>
+            <a:graphic>
+              <a:graphicData uri="http://schemas.openxmlformats.org/drawingml/2006/picture">
+                <pic:pic>
+                  <pic:nvPicPr>
+                    <pic:cNvPr id="0" name="forest-major_inaccuracy-arms-1.png"/>
+                    <pic:cNvPicPr/>
+                  </pic:nvPicPr>
+                  <pic:blipFill>
+                    <a:blip r:embed="rId17"/>
+                    <a:stretch>
+                      <a:fillRect/>
+                    </a:stretch>
+                  </pic:blipFill>
+                  <pic:spPr>
+                    <a:xfrm>
+                      <a:off x="0" y="0"/>
+                      <a:ext cx="6126480" cy="2097590"/>
+                    </a:xfrm>
+                    <a:prstGeom prst="rect"/>
+                  </pic:spPr>
+                </pic:pic>
+              </a:graphicData>
+            </a:graphic>
+          </wp:inline>
+        </w:drawing>
+      </w:r>
+    </w:p>
+    <w:p>
+      <w:r>
+        <w:rPr>
+          <w:sz w:val="18"/>
+        </w:rPr>
+        <w:t>Any major inaccuracy, all 9 arms.</w:t>
+      </w:r>
+    </w:p>
+    <w:p>
+      <w:pPr>
+        <w:pStyle w:val="Heading1"/>
+        <w:keepNext/>
       </w:pPr>
       <w:r>
         <w:t>PRISMA flow diagram</w:t>
@@ -1520,8 +1923,8 @@
       <w:r>
         <w:drawing>
           <wp:inline xmlns:a="http://schemas.openxmlformats.org/drawingml/2006/main" xmlns:pic="http://schemas.openxmlformats.org/drawingml/2006/picture">
-            <wp:extent cx="5029200" cy="6508376"/>
-            <wp:docPr id="3" name="Picture 3"/>
+            <wp:extent cx="6076603" cy="7863839"/>
+            <wp:docPr id="10" name="Picture 10"/>
             <wp:cNvGraphicFramePr>
               <a:graphicFrameLocks noChangeAspect="1"/>
             </wp:cNvGraphicFramePr>
@@ -1533,7 +1936,7 @@
                     <pic:cNvPicPr/>
                   </pic:nvPicPr>
                   <pic:blipFill>
-                    <a:blip r:embed="rId11"/>
+                    <a:blip r:embed="rId18"/>
                     <a:stretch>
                       <a:fillRect/>
                     </a:stretch>
@@ -1541,7 +1944,7 @@
                   <pic:spPr>
                     <a:xfrm>
                       <a:off x="0" y="0"/>
-                      <a:ext cx="5029200" cy="6508376"/>
+                      <a:ext cx="6076603" cy="7863839"/>
                     </a:xfrm>
                     <a:prstGeom prst="rect"/>
                   </pic:spPr>

</xml_diff>